<commit_message>
Updated the Word Doc content with actual Repo link
</commit_message>
<xml_diff>
--- a/docs/SuiGit-Onboarding.docx
+++ b/docs/SuiGit-Onboarding.docx
@@ -351,7 +351,21 @@
           <w:rFonts w:ascii="Consolas" w:hAnsi="Consolas"/>
           <w:sz w:val="18"/>
         </w:rPr>
-        <w:t>git clone &lt;your-suigit-repo-url&gt;</w:t>
+        <w:t xml:space="preserve">git clone </w:t>
+      </w:r>
+      <w:r>
+        <w:rPr>
+          <w:rFonts w:ascii="Consolas" w:hAnsi="Consolas"/>
+          <w:sz w:val="18"/>
+        </w:rPr>
+        <w:t>https://github.com/ahipsharma/SuiGit</w:t>
+      </w:r>
+      <w:r>
+        <w:rPr>
+          <w:rFonts w:ascii="Consolas" w:hAnsi="Consolas"/>
+          <w:sz w:val="18"/>
+        </w:rPr>
+        <w:t xml:space="preserve"> </w:t>
       </w:r>
       <w:r>
         <w:rPr>
@@ -359,8 +373,17 @@
           <w:sz w:val="18"/>
         </w:rPr>
         <w:br/>
-        <w:t>code SuiGit</w:t>
-      </w:r>
+        <w:t xml:space="preserve">code </w:t>
+      </w:r>
+      <w:proofErr w:type="spellStart"/>
+      <w:r>
+        <w:rPr>
+          <w:rFonts w:ascii="Consolas" w:hAnsi="Consolas"/>
+          <w:sz w:val="18"/>
+        </w:rPr>
+        <w:t>SuiGit</w:t>
+      </w:r>
+      <w:proofErr w:type="spellEnd"/>
     </w:p>
     <w:p>
       <w:pPr>
@@ -568,19 +591,11 @@
       <w:pPr>
         <w:pStyle w:val="Heading2"/>
       </w:pPr>
-      <w:proofErr w:type="gramStart"/>
       <w:r>
         <w:rPr>
           <w:color w:val="2F5496"/>
         </w:rPr>
-        <w:t>B.4  Create</w:t>
-      </w:r>
-      <w:proofErr w:type="gramEnd"/>
-      <w:r>
-        <w:rPr>
-          <w:color w:val="2F5496"/>
-        </w:rPr>
-        <w:t xml:space="preserve"> the Integration record (in NetSuite UI)</w:t>
+        <w:t>B.4  Create the Integration record (in NetSuite UI)</w:t>
       </w:r>
     </w:p>
     <w:p>
@@ -842,6 +857,12 @@
           <w:sz w:val="18"/>
         </w:rPr>
         <w:br/>
+      </w:r>
+      <w:r>
+        <w:rPr>
+          <w:rFonts w:ascii="Consolas" w:hAnsi="Consolas"/>
+          <w:sz w:val="18"/>
+        </w:rPr>
         <w:t xml:space="preserve">  "consumerSecret":  "&lt;from step B.4&gt;",</w:t>
       </w:r>
       <w:r>
@@ -1033,6 +1054,12 @@
           <w:sz w:val="18"/>
         </w:rPr>
         <w:br/>
+      </w:r>
+      <w:r>
+        <w:rPr>
+          <w:rFonts w:ascii="Consolas" w:hAnsi="Consolas"/>
+          <w:sz w:val="18"/>
+        </w:rPr>
         <w:t xml:space="preserve">    "key": "shift+alt+u",</w:t>
       </w:r>
       <w:r>

</xml_diff>